<commit_message>
Actualización de casos de uso
</commit_message>
<xml_diff>
--- a/Documentación/casos-de-uso/00_1__CU_Inicio_Sesion_PLANTILLA.docx
+++ b/Documentación/casos-de-uso/00_1__CU_Inicio_Sesion_PLANTILLA.docx
@@ -42,7 +42,16 @@
           <w:sz w:val="32"/>
           <w:szCs w:val="32"/>
         </w:rPr>
-        <w:t>CU-00.1 Ingreso al Sistema — Personal de la Clínica</w:t>
+        <w:t xml:space="preserve">CU-00.1 Ingreso al Sistema — </w:t>
+      </w:r>
+      <w:r>
+        <w:rPr>
+          <w:b/>
+          <w:bCs/>
+          <w:sz w:val="32"/>
+          <w:szCs w:val="32"/>
+        </w:rPr>
+        <w:t>Usuarios (Empleados y Pacientes)</w:t>
       </w:r>
     </w:p>
     <w:p>
@@ -1100,7 +1109,13 @@
         <w:ind w:left="360"/>
       </w:pPr>
       <w:r>
-        <w:t>Proteger el acceso al sistema y los expedientes de los pacientes, asegurando que quien ingresa es físicamente el empleado registrado.</w:t>
+        <w:t xml:space="preserve">Proteger el acceso al sistema y los expedientes de los pacientes, asegurando que quien ingresa es físicamente el </w:t>
+      </w:r>
+      <w:r>
+        <w:t>usuario</w:t>
+      </w:r>
+      <w:r>
+        <w:t xml:space="preserve"> registrado.</w:t>
       </w:r>
     </w:p>
     <w:p>
@@ -1175,6 +1190,14 @@
       </w:r>
       <w:r>
         <w:t xml:space="preserve"> </w:t>
+      </w:r>
+    </w:p>
+    <w:p>
+      <w:pPr>
+        <w:spacing w:after="80"/>
+      </w:pPr>
+      <w:r>
+        <w:t>Usuarios Pacientes</w:t>
       </w:r>
     </w:p>
     <w:p>
@@ -1225,20 +1248,19 @@
         <w:spacing w:after="60"/>
       </w:pPr>
       <w:r>
-        <w:t>El empleado debe estar registrado en el sistema con su huella dactilar enrolada previamente (ver Caso de Uso 02).</w:t>
-      </w:r>
-    </w:p>
-    <w:p>
-      <w:pPr>
-        <w:pStyle w:val="Prrafodelista"/>
-        <w:numPr>
-          <w:ilvl w:val="0"/>
-          <w:numId w:val="2"/>
-        </w:numPr>
-        <w:spacing w:after="60"/>
-      </w:pPr>
-      <w:r>
-        <w:t>El lector de huella dactilar debe estar conectado y funcionando en la computadora de trabajo.</w:t>
+        <w:t xml:space="preserve">El </w:t>
+      </w:r>
+      <w:r>
+        <w:t>usuario</w:t>
+      </w:r>
+      <w:r>
+        <w:t xml:space="preserve"> debe estar registrado en el sistema (ver Caso de Uso 02</w:t>
+      </w:r>
+      <w:r>
+        <w:t xml:space="preserve"> y caso de Uso Pacientes</w:t>
+      </w:r>
+      <w:r>
+        <w:t>).</w:t>
       </w:r>
     </w:p>
     <w:p>
@@ -1273,46 +1295,67 @@
     </w:p>
     <w:p>
       <w:pPr>
+        <w:pStyle w:val="Prrafodelista"/>
+        <w:numPr>
+          <w:ilvl w:val="0"/>
+          <w:numId w:val="5"/>
+        </w:numPr>
         <w:spacing w:after="60"/>
-        <w:ind w:left="360"/>
-      </w:pPr>
-      <w:r>
-        <w:t>FB1. El empleado ingresa al sitio web de la clínica y selecciona "Login".</w:t>
-      </w:r>
-    </w:p>
-    <w:p>
-      <w:pPr>
+      </w:pPr>
+      <w:r>
+        <w:t xml:space="preserve">El </w:t>
+      </w:r>
+      <w:r>
+        <w:t>usuario</w:t>
+      </w:r>
+      <w:r>
+        <w:t xml:space="preserve"> ingresa al sitio web de la clínica y selecciona "</w:t>
+      </w:r>
+      <w:r>
+        <w:t>Iniciar sesión</w:t>
+      </w:r>
+      <w:r>
+        <w:t>".</w:t>
+      </w:r>
+    </w:p>
+    <w:p>
+      <w:pPr>
+        <w:pStyle w:val="Prrafodelista"/>
+        <w:numPr>
+          <w:ilvl w:val="0"/>
+          <w:numId w:val="5"/>
+        </w:numPr>
         <w:spacing w:after="60"/>
-        <w:ind w:left="360"/>
-      </w:pPr>
-      <w:r>
-        <w:t>FB2. El sistema muestra la pantalla de ingreso.</w:t>
-      </w:r>
-    </w:p>
-    <w:p>
-      <w:pPr>
+      </w:pPr>
+      <w:r>
+        <w:t>El sistema muestra la pantalla de ingreso.</w:t>
+      </w:r>
+    </w:p>
+    <w:p>
+      <w:pPr>
+        <w:pStyle w:val="Prrafodelista"/>
+        <w:numPr>
+          <w:ilvl w:val="0"/>
+          <w:numId w:val="5"/>
+        </w:numPr>
         <w:spacing w:after="60"/>
-        <w:ind w:left="360"/>
-      </w:pPr>
-      <w:r>
-        <w:t>FB3. El empleado escribe su correo electrónico y contraseña.</w:t>
-      </w:r>
-      <w:r>
         <w:rPr>
           <w:b/>
           <w:bCs/>
           <w:color w:val="185FA5"/>
         </w:rPr>
-        <w:t xml:space="preserve">  [RN03]</w:t>
-      </w:r>
-    </w:p>
-    <w:p>
-      <w:pPr>
-        <w:spacing w:after="60"/>
-        <w:ind w:left="360"/>
-      </w:pPr>
-      <w:r>
-        <w:t>FB4. El sistema valida las credenciales ingresadas.</w:t>
+      </w:pPr>
+      <w:r>
+        <w:t xml:space="preserve">El </w:t>
+      </w:r>
+      <w:r>
+        <w:t>usuario</w:t>
+      </w:r>
+      <w:r>
+        <w:t xml:space="preserve"> escribe su correo electrónico y contraseña.</w:t>
+      </w:r>
+      <w:r>
+        <w:t xml:space="preserve">  </w:t>
       </w:r>
       <w:r>
         <w:rPr>
@@ -1320,25 +1363,60 @@
           <w:bCs/>
           <w:color w:val="185FA5"/>
         </w:rPr>
-        <w:t xml:space="preserve">  [FA01]</w:t>
-      </w:r>
-    </w:p>
-    <w:p>
-      <w:pPr>
+        <w:t>[RN03]</w:t>
+      </w:r>
+    </w:p>
+    <w:p>
+      <w:pPr>
+        <w:pStyle w:val="Prrafodelista"/>
+        <w:numPr>
+          <w:ilvl w:val="0"/>
+          <w:numId w:val="5"/>
+        </w:numPr>
         <w:spacing w:after="60"/>
-        <w:ind w:left="360"/>
-      </w:pPr>
-      <w:r>
-        <w:t>FB5. El sistema aprueba el ingreso y muestra al empleado su área de trabajo según su cargo.</w:t>
-      </w:r>
-    </w:p>
-    <w:p>
-      <w:pPr>
+      </w:pPr>
+      <w:r>
+        <w:t>El sistema valida las credenciales ingresadas.</w:t>
+      </w:r>
+      <w:r>
+        <w:t xml:space="preserve">  </w:t>
+      </w:r>
+      <w:r>
+        <w:rPr>
+          <w:b/>
+          <w:bCs/>
+          <w:color w:val="185FA5"/>
+        </w:rPr>
+        <w:t>[FA01]</w:t>
+      </w:r>
+    </w:p>
+    <w:p>
+      <w:pPr>
+        <w:pStyle w:val="Prrafodelista"/>
+        <w:numPr>
+          <w:ilvl w:val="0"/>
+          <w:numId w:val="5"/>
+        </w:numPr>
         <w:spacing w:after="60"/>
-        <w:ind w:left="360"/>
-      </w:pPr>
-      <w:r>
-        <w:t>FB6. Fin del caso de uso.</w:t>
+      </w:pPr>
+      <w:r>
+        <w:t>El sistema verifica el rol del usuario (empleado o paciente) y muestra la pantalla correspondiente</w:t>
+      </w:r>
+      <w:r>
+        <w:t>.</w:t>
+      </w:r>
+    </w:p>
+    <w:p>
+      <w:pPr>
+        <w:pStyle w:val="Prrafodelista"/>
+        <w:numPr>
+          <w:ilvl w:val="0"/>
+          <w:numId w:val="5"/>
+        </w:numPr>
+        <w:spacing w:after="60"/>
+      </w:pPr>
+      <w:r>
+        <w:t>Fin del caso de uso.</w:t>
       </w:r>
     </w:p>
     <w:p>
@@ -1986,6 +2064,98 @@
     </w:lvl>
   </w:abstractNum>
   <w:abstractNum w:abstractNumId="2" w15:restartNumberingAfterBreak="0">
+    <w:nsid w:val="4DD34AB6"/>
+    <w:multiLevelType w:val="hybridMultilevel"/>
+    <w:tmpl w:val="DE063016"/>
+    <w:lvl w:ilvl="0" w:tplc="42EE0534">
+      <w:start w:val="1"/>
+      <w:numFmt w:val="decimal"/>
+      <w:lvlText w:val="%1."/>
+      <w:lvlJc w:val="left"/>
+      <w:pPr>
+        <w:ind w:left="720" w:hanging="360"/>
+      </w:pPr>
+      <w:rPr>
+        <w:rFonts w:hint="default"/>
+        <w:b/>
+        <w:bCs/>
+        <w:color w:val="auto"/>
+      </w:rPr>
+    </w:lvl>
+    <w:lvl w:ilvl="1" w:tplc="100A0019" w:tentative="1">
+      <w:start w:val="1"/>
+      <w:numFmt w:val="lowerLetter"/>
+      <w:lvlText w:val="%2."/>
+      <w:lvlJc w:val="left"/>
+      <w:pPr>
+        <w:ind w:left="1440" w:hanging="360"/>
+      </w:pPr>
+    </w:lvl>
+    <w:lvl w:ilvl="2" w:tplc="100A001B" w:tentative="1">
+      <w:start w:val="1"/>
+      <w:numFmt w:val="lowerRoman"/>
+      <w:lvlText w:val="%3."/>
+      <w:lvlJc w:val="right"/>
+      <w:pPr>
+        <w:ind w:left="2160" w:hanging="180"/>
+      </w:pPr>
+    </w:lvl>
+    <w:lvl w:ilvl="3" w:tplc="100A000F" w:tentative="1">
+      <w:start w:val="1"/>
+      <w:numFmt w:val="decimal"/>
+      <w:lvlText w:val="%4."/>
+      <w:lvlJc w:val="left"/>
+      <w:pPr>
+        <w:ind w:left="2880" w:hanging="360"/>
+      </w:pPr>
+    </w:lvl>
+    <w:lvl w:ilvl="4" w:tplc="100A0019" w:tentative="1">
+      <w:start w:val="1"/>
+      <w:numFmt w:val="lowerLetter"/>
+      <w:lvlText w:val="%5."/>
+      <w:lvlJc w:val="left"/>
+      <w:pPr>
+        <w:ind w:left="3600" w:hanging="360"/>
+      </w:pPr>
+    </w:lvl>
+    <w:lvl w:ilvl="5" w:tplc="100A001B" w:tentative="1">
+      <w:start w:val="1"/>
+      <w:numFmt w:val="lowerRoman"/>
+      <w:lvlText w:val="%6."/>
+      <w:lvlJc w:val="right"/>
+      <w:pPr>
+        <w:ind w:left="4320" w:hanging="180"/>
+      </w:pPr>
+    </w:lvl>
+    <w:lvl w:ilvl="6" w:tplc="100A000F" w:tentative="1">
+      <w:start w:val="1"/>
+      <w:numFmt w:val="decimal"/>
+      <w:lvlText w:val="%7."/>
+      <w:lvlJc w:val="left"/>
+      <w:pPr>
+        <w:ind w:left="5040" w:hanging="360"/>
+      </w:pPr>
+    </w:lvl>
+    <w:lvl w:ilvl="7" w:tplc="100A0019" w:tentative="1">
+      <w:start w:val="1"/>
+      <w:numFmt w:val="lowerLetter"/>
+      <w:lvlText w:val="%8."/>
+      <w:lvlJc w:val="left"/>
+      <w:pPr>
+        <w:ind w:left="5760" w:hanging="360"/>
+      </w:pPr>
+    </w:lvl>
+    <w:lvl w:ilvl="8" w:tplc="100A001B" w:tentative="1">
+      <w:start w:val="1"/>
+      <w:numFmt w:val="lowerRoman"/>
+      <w:lvlText w:val="%9."/>
+      <w:lvlJc w:val="right"/>
+      <w:pPr>
+        <w:ind w:left="6480" w:hanging="180"/>
+      </w:pPr>
+    </w:lvl>
+  </w:abstractNum>
+  <w:abstractNum w:abstractNumId="3" w15:restartNumberingAfterBreak="0">
     <w:nsid w:val="6ECD0C81"/>
     <w:multiLevelType w:val="hybridMultilevel"/>
     <w:tmpl w:val="B6C6750A"/>
@@ -2039,7 +2209,7 @@
       <w:lvlJc w:val="left"/>
     </w:lvl>
   </w:abstractNum>
-  <w:abstractNum w:abstractNumId="3" w15:restartNumberingAfterBreak="0">
+  <w:abstractNum w:abstractNumId="4" w15:restartNumberingAfterBreak="0">
     <w:nsid w:val="7D95215F"/>
     <w:multiLevelType w:val="multilevel"/>
     <w:tmpl w:val="100A001F"/>
@@ -2132,16 +2302,19 @@
     </w:lvlOverride>
   </w:num>
   <w:num w:numId="2" w16cid:durableId="1472938145">
-    <w:abstractNumId w:val="2"/>
+    <w:abstractNumId w:val="3"/>
     <w:lvlOverride w:ilvl="0">
       <w:startOverride w:val="1"/>
     </w:lvlOverride>
   </w:num>
   <w:num w:numId="3" w16cid:durableId="700979094">
-    <w:abstractNumId w:val="3"/>
+    <w:abstractNumId w:val="4"/>
   </w:num>
   <w:num w:numId="4" w16cid:durableId="740637841">
     <w:abstractNumId w:val="1"/>
+  </w:num>
+  <w:num w:numId="5" w16cid:durableId="457335690">
+    <w:abstractNumId w:val="2"/>
   </w:num>
 </w:numbering>
 </file>
@@ -2631,7 +2804,6 @@
   <w:style w:type="character" w:default="1" w:styleId="Fuentedeprrafopredeter">
     <w:name w:val="Default Paragraph Font"/>
     <w:uiPriority w:val="1"/>
-    <w:semiHidden/>
     <w:unhideWhenUsed/>
   </w:style>
   <w:style w:type="table" w:default="1" w:styleId="Tablanormal">

</xml_diff>